<commit_message>
Emphasize hands-on model development and engineering in introduction
</commit_message>
<xml_diff>
--- a/resume/Raji_Ramachandran_Resume.docx
+++ b/resume/Raji_Ramachandran_Resume.docx
@@ -53,10 +53,7 @@
     </w:p>
     <w:p>
       <w:r>
-        <w:rPr>
-          <w:b w:val="0"/>
-        </w:rPr>
-        <w:t>Senior analytics, data and technology executive with 25+ years in financial services and payment processing. Leads global teams delivering model governance, regulatory remediation, enterprise data quality and operational automation. Personally designs, develops and codes analytical models and reusable software, combining hands-on engineering with stakeholder alignment and adoption across teams. Recent independent projects demonstrate agent governance, resumable orchestration and objective evaluation. Ph.D. economist and M.S. computer scientist; co-inventor of patented analytical methods.</w:t>
+        <w:t>Hands-on quantitative model developer and software engineer with 25+ years in financial services and payment processing. Designs, develops and codes analytical models and reusable software for model development, deployment, continuous monitoring and root-cause analysis. Experience spans credit risk, forecasting, AML, model governance, regulatory remediation and enterprise data quality. Independent AI projects demonstrate agent governance, resumable orchestration and objective evaluation. Ph.D. economist and M.S. computer scientist; co-inventor of analytical methods.</w:t>
       </w:r>
     </w:p>
     <w:p>
@@ -64,7 +61,7 @@
         <w:pStyle w:val="Heading1"/>
       </w:pPr>
       <w:r>
-        <w:t>Leadership and Technical Expertise</w:t>
+        <w:t>Technical Expertise</w:t>
       </w:r>
     </w:p>
     <w:p>

</xml_diff>

<commit_message>
Preserve exact Justia patent URLs in resume and portfolio
</commit_message>
<xml_diff>
--- a/resume/Raji_Ramachandran_Resume.docx
+++ b/resume/Raji_Ramachandran_Resume.docx
@@ -774,28 +774,27 @@
       <w:r>
         <w:t xml:space="preserve">Co-inventor: </w:t>
       </w:r>
-      <w:hyperlink r:id="rId15">
+      <w:r>
+        <w:t>Methods and Systems for Assessing Data Quality (US 20130073594 A1; granted as US 10,248,672 B2)</w:t>
+        <w:br/>
+      </w:r>
+      <w:hyperlink r:id="rId17">
         <w:r>
-          <w:rPr>
-            <w:color w:val="000000"/>
-          </w:rPr>
-          <w:t>Methods and Systems for Assessing Data Quality (US 10,248,672 B2)</w:t>
+          <w:t>https://patents.justia.com/patent/20130073594</w:t>
         </w:r>
       </w:hyperlink>
       <w:r>
-        <w:t xml:space="preserve">; </w:t>
+        <w:br/>
+      </w:r>
+      <w:r>
+        <w:t>Methods and Systems for Evaluating Predictive Models (US 20140379310 A1; abandoned application)</w:t>
+        <w:br/>
       </w:r>
       <w:hyperlink r:id="rId16">
         <w:r>
-          <w:rPr>
-            <w:color w:val="000000"/>
-          </w:rPr>
-          <w:t>Methods and Systems for Evaluating Predictive Models (US 20140379310 A1; abandoned application)</w:t>
+          <w:t>https://patents.justia.com/patent/20140379310</w:t>
         </w:r>
       </w:hyperlink>
-      <w:r>
-        <w:t>.</w:t>
-      </w:r>
     </w:p>
     <w:sectPr>
       <w:footerReference w:type="default" r:id="rId9"/>

</xml_diff>

<commit_message>
Add three selected research publications to resume
</commit_message>
<xml_diff>
--- a/resume/Raji_Ramachandran_Resume.docx
+++ b/resume/Raji_Ramachandran_Resume.docx
@@ -796,6 +796,62 @@
         </w:r>
       </w:hyperlink>
     </w:p>
+    <w:p>
+      <w:pPr>
+        <w:pStyle w:val="Heading1"/>
+      </w:pPr>
+      <w:r>
+        <w:t>Selected Publications</w:t>
+      </w:r>
+    </w:p>
+    <w:p>
+      <w:pPr>
+        <w:keepLines/>
+      </w:pPr>
+      <w:r>
+        <w:t xml:space="preserve">2001 | </w:t>
+      </w:r>
+      <w:hyperlink r:id="rId18">
+        <w:r>
+          <w:t>Robust Estimation of GARMA Model Parameters with an Application to Cointegration among Interest Rates of Industrialized Countries</w:t>
+        </w:r>
+      </w:hyperlink>
+      <w:r>
+        <w:t>. With Paul Beaumont. Computational Economics, 17, 179–201.</w:t>
+      </w:r>
+    </w:p>
+    <w:p>
+      <w:pPr>
+        <w:keepLines/>
+      </w:pPr>
+      <w:r>
+        <w:t xml:space="preserve">2000 | </w:t>
+      </w:r>
+      <w:hyperlink r:id="rId19">
+        <w:r>
+          <w:t>Generalized Autoregressive Moving Average Modeling of the Bellcore Data</w:t>
+        </w:r>
+      </w:hyperlink>
+      <w:r>
+        <w:t>. With Venkat R. Bhethanabotla. Proceedings of the 25th IEEE Conference on Local Computer Networks.</w:t>
+      </w:r>
+    </w:p>
+    <w:p>
+      <w:pPr>
+        <w:keepLines/>
+      </w:pPr>
+      <w:r>
+        <w:t xml:space="preserve">2015 | </w:t>
+      </w:r>
+      <w:hyperlink r:id="rId20">
+        <w:r>
+          <w:t>Improving Financial Services Data Quality – A Financial Company Practice</w:t>
+        </w:r>
+      </w:hyperlink>
+      <w:r>
+        <w:t>. Co-author. International Journal of Lean Six Sigma, 6(2), 98–110.</w:t>
+      </w:r>
+    </w:p>
     <w:sectPr>
       <w:footerReference w:type="default" r:id="rId9"/>
       <w:pgSz w:w="12240" w:h="15840"/>

</xml_diff>

<commit_message>
Add selected conference presentations to resume
</commit_message>
<xml_diff>
--- a/resume/Raji_Ramachandran_Resume.docx
+++ b/resume/Raji_Ramachandran_Resume.docx
@@ -852,6 +852,22 @@
         <w:t>. Co-author. International Journal of Lean Six Sigma, 6(2), 98–110.</w:t>
       </w:r>
     </w:p>
+    <w:p>
+      <w:pPr>
+        <w:pStyle w:val="Heading1"/>
+      </w:pPr>
+      <w:r>
+        <w:t>Selected Presentations</w:t>
+      </w:r>
+    </w:p>
+    <w:p>
+      <w:pPr>
+        <w:keepLines/>
+      </w:pPr>
+      <w:r>
+        <w:t>Presentations at the Society of Computational Economics, IEEE LCN, Agent 2003 (University of Chicago), and Predictive Analytics World.</w:t>
+      </w:r>
+    </w:p>
     <w:sectPr>
       <w:footerReference w:type="default" r:id="rId9"/>
       <w:pgSz w:w="12240" w:h="15840"/>

</xml_diff>